<commit_message>
docs: adiciona capturas de tela e atualiza documento executivo Word com demonstracao visual
</commit_message>
<xml_diff>
--- a/Desafio 4/InsurMinds – Desafio 4.docx
+++ b/Desafio 4/InsurMinds – Desafio 4.docx
@@ -25,13 +25,7 @@
         <w:rPr>
           <w:sz w:val="36"/>
         </w:rPr>
-        <w:t>4</w:t>
-      </w:r>
-      <w:r>
-        <w:rPr>
-          <w:sz w:val="36"/>
-        </w:rPr>
-        <w:t xml:space="preserve"> </w:t>
+        <w:t xml:space="preserve">4 </w:t>
       </w:r>
     </w:p>
     <w:p>
@@ -70,149 +64,6 @@
     </w:p>
     <w:p>
       <w:pPr>
-        <w:spacing w:after="72"/>
-        <w:ind w:right="1"/>
-      </w:pPr>
-      <w:r>
-        <w:t xml:space="preserve">Assunto: </w:t>
-      </w:r>
-      <w:proofErr w:type="spellStart"/>
-      <w:r>
-        <w:t>InsurMinds</w:t>
-      </w:r>
-      <w:proofErr w:type="spellEnd"/>
-      <w:r>
-        <w:t xml:space="preserve"> – Desafio </w:t>
-      </w:r>
-      <w:r>
-        <w:t>4</w:t>
-      </w:r>
-      <w:r>
-        <w:t xml:space="preserve"> </w:t>
-      </w:r>
-    </w:p>
-    <w:p>
-      <w:pPr>
-        <w:spacing w:after="88"/>
-        <w:ind w:right="1"/>
-      </w:pPr>
-      <w:r>
-        <w:t xml:space="preserve">Anexos:  </w:t>
-      </w:r>
-      <w:proofErr w:type="spellStart"/>
-      <w:r>
-        <w:t>First_Class_Agents_Análise</w:t>
-      </w:r>
-      <w:proofErr w:type="spellEnd"/>
-      <w:r>
-        <w:t xml:space="preserve"> de CSV.pdf </w:t>
-      </w:r>
-    </w:p>
-    <w:p>
-      <w:pPr>
-        <w:spacing w:after="82" w:line="259" w:lineRule="auto"/>
-        <w:ind w:left="-29" w:right="-29" w:firstLine="0"/>
-      </w:pPr>
-      <w:r>
-        <w:rPr>
-          <w:noProof/>
-          <w:sz w:val="22"/>
-        </w:rPr>
-        <mc:AlternateContent>
-          <mc:Choice Requires="wpg">
-            <w:drawing>
-              <wp:inline distT="0" distB="0" distL="0" distR="0" wp14:anchorId="5C6A177B" wp14:editId="6D13B4AE">
-                <wp:extent cx="5708270" cy="9144"/>
-                <wp:effectExtent l="0" t="0" r="0" b="0"/>
-                <wp:docPr id="17170" name="Group 17170"/>
-                <wp:cNvGraphicFramePr/>
-                <a:graphic xmlns:a="http://schemas.openxmlformats.org/drawingml/2006/main">
-                  <a:graphicData uri="http://schemas.microsoft.com/office/word/2010/wordprocessingGroup">
-                    <wpg:wgp>
-                      <wpg:cNvGrpSpPr/>
-                      <wpg:grpSpPr>
-                        <a:xfrm>
-                          <a:off x="0" y="0"/>
-                          <a:ext cx="5708270" cy="9144"/>
-                          <a:chOff x="0" y="0"/>
-                          <a:chExt cx="5708270" cy="9144"/>
-                        </a:xfrm>
-                      </wpg:grpSpPr>
-                      <wps:wsp>
-                        <wps:cNvPr id="18510" name="Shape 18510"/>
-                        <wps:cNvSpPr/>
-                        <wps:spPr>
-                          <a:xfrm>
-                            <a:off x="0" y="0"/>
-                            <a:ext cx="5708270" cy="9144"/>
-                          </a:xfrm>
-                          <a:custGeom>
-                            <a:avLst/>
-                            <a:gdLst/>
-                            <a:ahLst/>
-                            <a:cxnLst/>
-                            <a:rect l="0" t="0" r="0" b="0"/>
-                            <a:pathLst>
-                              <a:path w="5708270" h="9144">
-                                <a:moveTo>
-                                  <a:pt x="0" y="0"/>
-                                </a:moveTo>
-                                <a:lnTo>
-                                  <a:pt x="5708270" y="0"/>
-                                </a:lnTo>
-                                <a:lnTo>
-                                  <a:pt x="5708270" y="9144"/>
-                                </a:lnTo>
-                                <a:lnTo>
-                                  <a:pt x="0" y="9144"/>
-                                </a:lnTo>
-                                <a:lnTo>
-                                  <a:pt x="0" y="0"/>
-                                </a:lnTo>
-                              </a:path>
-                            </a:pathLst>
-                          </a:custGeom>
-                          <a:ln w="0" cap="flat">
-                            <a:miter lim="127000"/>
-                          </a:ln>
-                        </wps:spPr>
-                        <wps:style>
-                          <a:lnRef idx="0">
-                            <a:srgbClr val="000000">
-                              <a:alpha val="0"/>
-                            </a:srgbClr>
-                          </a:lnRef>
-                          <a:fillRef idx="1">
-                            <a:srgbClr val="4472C4"/>
-                          </a:fillRef>
-                          <a:effectRef idx="0">
-                            <a:scrgbClr r="0" g="0" b="0"/>
-                          </a:effectRef>
-                          <a:fontRef idx="none"/>
-                        </wps:style>
-                        <wps:bodyPr/>
-                      </wps:wsp>
-                    </wpg:wgp>
-                  </a:graphicData>
-                </a:graphic>
-              </wp:inline>
-            </w:drawing>
-          </mc:Choice>
-          <mc:Fallback xmlns:a="http://schemas.openxmlformats.org/drawingml/2006/main">
-            <w:pict>
-              <v:group id="Group 17170" style="width:449.47pt;height:0.719971pt;mso-position-horizontal-relative:char;mso-position-vertical-relative:line" coordsize="57082,91">
-                <v:shape id="Shape 18511" style="position:absolute;width:57082;height:91;left:0;top:0;" coordsize="5708270,9144" path="m0,0l5708270,0l5708270,9144l0,9144l0,0">
-                  <v:stroke weight="0pt" endcap="flat" joinstyle="miter" miterlimit="10" on="false" color="#000000" opacity="0"/>
-                  <v:fill on="true" color="#4472c4"/>
-                </v:shape>
-              </v:group>
-            </w:pict>
-          </mc:Fallback>
-        </mc:AlternateContent>
-      </w:r>
-    </w:p>
-    <w:p>
-      <w:pPr>
         <w:spacing w:after="315" w:line="263" w:lineRule="auto"/>
         <w:ind w:left="-5"/>
       </w:pPr>
@@ -231,7 +82,6 @@
         <w:tblCellMar>
           <w:top w:w="70" w:type="dxa"/>
           <w:left w:w="108" w:type="dxa"/>
-          <w:bottom w:w="0" w:type="dxa"/>
           <w:right w:w="60" w:type="dxa"/>
         </w:tblCellMar>
         <w:tblLook w:val="04A0" w:firstRow="1" w:lastRow="0" w:firstColumn="1" w:lastColumn="0" w:noHBand="0" w:noVBand="1"/>
@@ -751,6 +601,109 @@
     </w:p>
     <w:p>
       <w:pPr>
+        <w:ind w:right="1"/>
+      </w:pPr>
+      <w:r>
+        <w:rPr>
+          <w:noProof/>
+          <w:sz w:val="22"/>
+        </w:rPr>
+        <mc:AlternateContent>
+          <mc:Choice Requires="wpg">
+            <w:drawing>
+              <wp:inline distT="0" distB="0" distL="0" distR="0" wp14:anchorId="7136BE83" wp14:editId="09ACA934">
+                <wp:extent cx="5671185" cy="8833"/>
+                <wp:effectExtent l="0" t="0" r="0" b="0"/>
+                <wp:docPr id="17170" name="Group 17170"/>
+                <wp:cNvGraphicFramePr/>
+                <a:graphic xmlns:a="http://schemas.openxmlformats.org/drawingml/2006/main">
+                  <a:graphicData uri="http://schemas.microsoft.com/office/word/2010/wordprocessingGroup">
+                    <wpg:wgp>
+                      <wpg:cNvGrpSpPr/>
+                      <wpg:grpSpPr>
+                        <a:xfrm>
+                          <a:off x="0" y="0"/>
+                          <a:ext cx="5671185" cy="8833"/>
+                          <a:chOff x="0" y="0"/>
+                          <a:chExt cx="5708270" cy="9144"/>
+                        </a:xfrm>
+                      </wpg:grpSpPr>
+                      <wps:wsp>
+                        <wps:cNvPr id="18510" name="Shape 18510"/>
+                        <wps:cNvSpPr/>
+                        <wps:spPr>
+                          <a:xfrm>
+                            <a:off x="0" y="0"/>
+                            <a:ext cx="5708270" cy="9144"/>
+                          </a:xfrm>
+                          <a:custGeom>
+                            <a:avLst/>
+                            <a:gdLst/>
+                            <a:ahLst/>
+                            <a:cxnLst/>
+                            <a:rect l="0" t="0" r="0" b="0"/>
+                            <a:pathLst>
+                              <a:path w="5708270" h="9144">
+                                <a:moveTo>
+                                  <a:pt x="0" y="0"/>
+                                </a:moveTo>
+                                <a:lnTo>
+                                  <a:pt x="5708270" y="0"/>
+                                </a:lnTo>
+                                <a:lnTo>
+                                  <a:pt x="5708270" y="9144"/>
+                                </a:lnTo>
+                                <a:lnTo>
+                                  <a:pt x="0" y="9144"/>
+                                </a:lnTo>
+                                <a:lnTo>
+                                  <a:pt x="0" y="0"/>
+                                </a:lnTo>
+                              </a:path>
+                            </a:pathLst>
+                          </a:custGeom>
+                          <a:ln w="0" cap="flat">
+                            <a:miter lim="127000"/>
+                          </a:ln>
+                        </wps:spPr>
+                        <wps:style>
+                          <a:lnRef idx="0">
+                            <a:srgbClr val="000000">
+                              <a:alpha val="0"/>
+                            </a:srgbClr>
+                          </a:lnRef>
+                          <a:fillRef idx="1">
+                            <a:srgbClr val="4472C4"/>
+                          </a:fillRef>
+                          <a:effectRef idx="0">
+                            <a:scrgbClr r="0" g="0" b="0"/>
+                          </a:effectRef>
+                          <a:fontRef idx="none"/>
+                        </wps:style>
+                        <wps:bodyPr/>
+                      </wps:wsp>
+                    </wpg:wgp>
+                  </a:graphicData>
+                </a:graphic>
+              </wp:inline>
+            </w:drawing>
+          </mc:Choice>
+          <mc:Fallback>
+            <w:pict>
+              <v:group w14:anchorId="48F207FB" id="Group 17170" o:spid="_x0000_s1026" style="width:446.55pt;height:.7pt;mso-position-horizontal-relative:char;mso-position-vertical-relative:line" coordsize="57082,91" o:gfxdata="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">
+                <v:shape id="Shape 18510" o:spid="_x0000_s1027" style="position:absolute;width:57082;height:91;visibility:visible;mso-wrap-style:square;v-text-anchor:top" coordsize="5708270,9144" o:gfxdata="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" path="m,l5708270,r,9144l,9144,,e" fillcolor="#4472c4" stroked="f" strokeweight="0">
+                  <v:stroke miterlimit="83231f" joinstyle="miter"/>
+                  <v:path arrowok="t" textboxrect="0,0,5708270,9144"/>
+                </v:shape>
+                <w10:anchorlock/>
+              </v:group>
+            </w:pict>
+          </mc:Fallback>
+        </mc:AlternateContent>
+      </w:r>
+    </w:p>
+    <w:p>
+      <w:pPr>
         <w:pStyle w:val="Ttulo1"/>
         <w:ind w:left="-5"/>
       </w:pPr>
@@ -1109,11 +1062,7 @@
         <w:t>linguagem natural</w:t>
       </w:r>
       <w:r>
-        <w:t xml:space="preserve"> e respostas automatizadas </w:t>
-      </w:r>
-      <w:r>
-        <w:lastRenderedPageBreak/>
-        <w:t xml:space="preserve">com alto nível de precisão. A </w:t>
+        <w:t xml:space="preserve"> e respostas automatizadas com alto nível de precisão. A </w:t>
       </w:r>
       <w:r>
         <w:rPr>
@@ -1168,6 +1117,7 @@
         <w:rPr>
           <w:b/>
         </w:rPr>
+        <w:lastRenderedPageBreak/>
         <w:t>Auditoria fiscal</w:t>
       </w:r>
       <w:r>
@@ -1438,9 +1388,6 @@
         <w:tblInd w:w="5" w:type="dxa"/>
         <w:tblCellMar>
           <w:top w:w="40" w:type="dxa"/>
-          <w:left w:w="0" w:type="dxa"/>
-          <w:bottom w:w="0" w:type="dxa"/>
-          <w:right w:w="0" w:type="dxa"/>
         </w:tblCellMar>
         <w:tblLook w:val="04A0" w:firstRow="1" w:lastRow="0" w:firstColumn="1" w:lastColumn="0" w:noHBand="0" w:noVBand="1"/>
       </w:tblPr>
@@ -3497,7 +3444,6 @@
           <w:noProof/>
           <w:sz w:val="22"/>
         </w:rPr>
-        <w:lastRenderedPageBreak/>
         <mc:AlternateContent>
           <mc:Choice Requires="wpg">
             <w:drawing>
@@ -3609,6 +3555,7 @@
         <w:ind w:left="-5"/>
       </w:pPr>
       <w:r>
+        <w:lastRenderedPageBreak/>
         <w:t xml:space="preserve">. EXECUÇÃO #1: FATURAMENTO TOTAL </w:t>
       </w:r>
     </w:p>
@@ -4807,7 +4754,6 @@
         <w:ind w:left="720" w:firstLine="0"/>
       </w:pPr>
       <w:r>
-        <w:lastRenderedPageBreak/>
         <w:t xml:space="preserve"> </w:t>
       </w:r>
     </w:p>
@@ -4830,6 +4776,7 @@
         <w:ind w:left="-5"/>
       </w:pPr>
       <w:r>
+        <w:lastRenderedPageBreak/>
         <w:t xml:space="preserve">EXECUÇÃO #4: CLIENTE COM MAIOR VOLUME DE COMPRA </w:t>
       </w:r>
     </w:p>
@@ -5771,7 +5718,6 @@
         <w:ind w:left="-5"/>
       </w:pPr>
       <w:r>
-        <w:lastRenderedPageBreak/>
         <w:t xml:space="preserve">EXECUÇÃO #6: TOP 5 PRODUTOS POR QUANTIDADE VENDIDA </w:t>
       </w:r>
     </w:p>
@@ -5890,6 +5836,7 @@
         <w:rPr>
           <w:b/>
         </w:rPr>
+        <w:lastRenderedPageBreak/>
         <w:t>Pergunta:</w:t>
       </w:r>
       <w:r>
@@ -6819,28 +6766,28 @@
       </w:r>
       <w:proofErr w:type="spellStart"/>
       <w:r>
+        <w:t>import</w:t>
+      </w:r>
+      <w:proofErr w:type="spellEnd"/>
+      <w:r>
+        <w:t xml:space="preserve"> pandas as </w:t>
+      </w:r>
+      <w:proofErr w:type="spellStart"/>
+      <w:r>
+        <w:t>pd</w:t>
+      </w:r>
+      <w:proofErr w:type="spellEnd"/>
+      <w:r>
+        <w:t xml:space="preserve"> top_3_states = </w:t>
+      </w:r>
+    </w:p>
+    <w:p>
+      <w:pPr>
+        <w:ind w:left="730" w:right="1"/>
+      </w:pPr>
+      <w:proofErr w:type="gramStart"/>
+      <w:r>
         <w:lastRenderedPageBreak/>
-        <w:t>import</w:t>
-      </w:r>
-      <w:proofErr w:type="spellEnd"/>
-      <w:r>
-        <w:t xml:space="preserve"> pandas as </w:t>
-      </w:r>
-      <w:proofErr w:type="spellStart"/>
-      <w:r>
-        <w:t>pd</w:t>
-      </w:r>
-      <w:proofErr w:type="spellEnd"/>
-      <w:r>
-        <w:t xml:space="preserve"> top_3_states = </w:t>
-      </w:r>
-    </w:p>
-    <w:p>
-      <w:pPr>
-        <w:ind w:left="730" w:right="1"/>
-      </w:pPr>
-      <w:proofErr w:type="gramStart"/>
-      <w:r>
         <w:t>df.groupby</w:t>
       </w:r>
       <w:proofErr w:type="gramEnd"/>
@@ -13382,17 +13329,17 @@
   <w:abstractNum w:abstractNumId="18" w15:restartNumberingAfterBreak="0">
     <w:nsid w:val="42FD3625"/>
     <w:multiLevelType w:val="hybridMultilevel"/>
-    <w:tmpl w:val="CD585710"/>
-    <w:lvl w:ilvl="0" w:tplc="93500184">
-      <w:start w:val="1"/>
-      <w:numFmt w:val="bullet"/>
-      <w:lvlText w:val="➔"/>
+    <w:tmpl w:val="FEAA6D7A"/>
+    <w:lvl w:ilvl="0" w:tplc="04160005">
+      <w:start w:val="1"/>
+      <w:numFmt w:val="bullet"/>
+      <w:lvlText w:val=""/>
       <w:lvlJc w:val="left"/>
       <w:pPr>
         <w:ind w:left="705"/>
       </w:pPr>
       <w:rPr>
-        <w:rFonts w:ascii="Wingdings" w:eastAsia="Wingdings" w:hAnsi="Wingdings" w:cs="Wingdings"/>
+        <w:rFonts w:ascii="Wingdings" w:hAnsi="Wingdings" w:hint="default"/>
         <w:b w:val="0"/>
         <w:i w:val="0"/>
         <w:strike w:val="0"/>

</xml_diff>